<commit_message>
feat: bold for check result name
</commit_message>
<xml_diff>
--- a/res/curation_log_template.docx
+++ b/res/curation_log_template.docx
@@ -83,16 +83,11 @@
             <w:r>
               <w:t xml:space="preserve"> {{ </w:t>
             </w:r>
-            <w:proofErr w:type="spellStart"/>
             <w:r>
               <w:t>project_metadata</w:t>
             </w:r>
             <w:r>
-              <w:t>.ticket_number</w:t>
-            </w:r>
-            <w:proofErr w:type="spellEnd"/>
-            <w:r>
-              <w:t xml:space="preserve"> }}</w:t>
+              <w:t>.ticket_number }}</w:t>
             </w:r>
           </w:p>
         </w:tc>
@@ -114,16 +109,11 @@
             <w:r>
               <w:t xml:space="preserve"> {{ </w:t>
             </w:r>
-            <w:proofErr w:type="spellStart"/>
             <w:r>
               <w:t>project_metadata</w:t>
             </w:r>
             <w:r>
-              <w:t>.curator_name</w:t>
-            </w:r>
-            <w:proofErr w:type="spellEnd"/>
-            <w:r>
-              <w:t xml:space="preserve"> }}</w:t>
+              <w:t>.curator_name }}</w:t>
             </w:r>
           </w:p>
         </w:tc>
@@ -147,16 +137,11 @@
             <w:r>
               <w:t xml:space="preserve"> {{ </w:t>
             </w:r>
-            <w:proofErr w:type="spellStart"/>
             <w:r>
               <w:t>project_metadata</w:t>
             </w:r>
             <w:r>
-              <w:t>.curator_email</w:t>
-            </w:r>
-            <w:proofErr w:type="spellEnd"/>
-            <w:r>
-              <w:t xml:space="preserve"> }}</w:t>
+              <w:t>.curator_email }}</w:t>
             </w:r>
           </w:p>
         </w:tc>
@@ -181,22 +166,18 @@
             <w:r>
               <w:t xml:space="preserve"> {{ </w:t>
             </w:r>
-            <w:proofErr w:type="spellStart"/>
             <w:r>
               <w:t>project_metadata</w:t>
             </w:r>
-            <w:proofErr w:type="spellEnd"/>
             <w:r>
               <w:t>.</w:t>
             </w:r>
-            <w:proofErr w:type="spellStart"/>
             <w:r>
               <w:rPr>
                 <w:lang w:val="en-US"/>
               </w:rPr>
               <w:t>dataset_title</w:t>
             </w:r>
-            <w:proofErr w:type="spellEnd"/>
             <w:r>
               <w:t xml:space="preserve"> }}</w:t>
             </w:r>
@@ -225,22 +206,18 @@
             <w:r>
               <w:t xml:space="preserve"> {{ </w:t>
             </w:r>
-            <w:proofErr w:type="spellStart"/>
             <w:r>
               <w:t>project_metadata</w:t>
             </w:r>
-            <w:proofErr w:type="spellEnd"/>
             <w:r>
               <w:t>.</w:t>
             </w:r>
-            <w:proofErr w:type="spellStart"/>
             <w:r>
               <w:rPr>
                 <w:lang w:val="en-US"/>
               </w:rPr>
               <w:t>dataset_pid</w:t>
             </w:r>
-            <w:proofErr w:type="spellEnd"/>
             <w:r>
               <w:t xml:space="preserve"> }}</w:t>
             </w:r>
@@ -268,24 +245,17 @@
               <w:t xml:space="preserve"> {{</w:t>
             </w:r>
             <w:r>
-              <w:t xml:space="preserve"> </w:t>
-            </w:r>
-            <w:proofErr w:type="spellStart"/>
-            <w:r>
-              <w:t>project_metadata</w:t>
-            </w:r>
-            <w:proofErr w:type="spellEnd"/>
+              <w:t xml:space="preserve"> project_metadata</w:t>
+            </w:r>
             <w:r>
               <w:t>.</w:t>
             </w:r>
-            <w:proofErr w:type="spellStart"/>
             <w:r>
               <w:rPr>
                 <w:lang w:val="en-US"/>
               </w:rPr>
               <w:t>dataset_id</w:t>
             </w:r>
-            <w:proofErr w:type="spellEnd"/>
             <w:r>
               <w:t xml:space="preserve"> }}</w:t>
             </w:r>
@@ -315,24 +285,17 @@
               <w:t xml:space="preserve"> {{</w:t>
             </w:r>
             <w:r>
-              <w:t xml:space="preserve"> </w:t>
-            </w:r>
-            <w:proofErr w:type="spellStart"/>
-            <w:r>
-              <w:t>project_metadata</w:t>
-            </w:r>
-            <w:proofErr w:type="spellEnd"/>
+              <w:t xml:space="preserve"> project_metadata</w:t>
+            </w:r>
             <w:r>
               <w:t>.</w:t>
             </w:r>
-            <w:proofErr w:type="spellStart"/>
             <w:r>
               <w:rPr>
                 <w:lang w:val="en-US"/>
               </w:rPr>
               <w:t>dataset_url</w:t>
             </w:r>
-            <w:proofErr w:type="spellEnd"/>
             <w:r>
               <w:t xml:space="preserve"> }}</w:t>
             </w:r>
@@ -361,17 +324,11 @@
               <w:t xml:space="preserve"> {{</w:t>
             </w:r>
             <w:r>
-              <w:t xml:space="preserve"> </w:t>
-            </w:r>
-            <w:proofErr w:type="spellStart"/>
-            <w:r>
-              <w:t>project_metadata</w:t>
-            </w:r>
-            <w:proofErr w:type="spellEnd"/>
+              <w:t xml:space="preserve"> project_metadata</w:t>
+            </w:r>
             <w:r>
               <w:t>.</w:t>
             </w:r>
-            <w:proofErr w:type="spellStart"/>
             <w:r>
               <w:rPr>
                 <w:rFonts w:hint="eastAsia"/>
@@ -379,7 +336,6 @@
               </w:rPr>
               <w:t>dataset_path</w:t>
             </w:r>
-            <w:proofErr w:type="spellEnd"/>
             <w:r>
               <w:t xml:space="preserve"> }}</w:t>
             </w:r>
@@ -408,22 +364,15 @@
             <w:r>
               <w:t xml:space="preserve"> {{ </w:t>
             </w:r>
-            <w:proofErr w:type="spellStart"/>
-            <w:r>
-              <w:t>project_metadata</w:t>
-            </w:r>
-            <w:proofErr w:type="spellEnd"/>
-            <w:r>
-              <w:t>.</w:t>
-            </w:r>
-            <w:proofErr w:type="spellStart"/>
+            <w:r>
+              <w:t>project_metadata.</w:t>
+            </w:r>
             <w:r>
               <w:rPr>
                 <w:lang w:val="en-US"/>
               </w:rPr>
               <w:t>log_init_date</w:t>
             </w:r>
-            <w:proofErr w:type="spellEnd"/>
             <w:r>
               <w:t xml:space="preserve"> }}</w:t>
             </w:r>
@@ -451,22 +400,18 @@
             <w:r>
               <w:t xml:space="preserve"> {{ </w:t>
             </w:r>
-            <w:proofErr w:type="spellStart"/>
             <w:r>
               <w:t>project_metadata</w:t>
             </w:r>
-            <w:proofErr w:type="spellEnd"/>
             <w:r>
               <w:t>.</w:t>
             </w:r>
-            <w:proofErr w:type="spellStart"/>
             <w:r>
               <w:rPr>
                 <w:lang w:val="en-US"/>
               </w:rPr>
               <w:t>last_modified_datetime</w:t>
             </w:r>
-            <w:proofErr w:type="spellEnd"/>
             <w:r>
               <w:t xml:space="preserve"> }}</w:t>
             </w:r>
@@ -478,6 +423,7 @@
     <w:tbl>
       <w:tblPr>
         <w:tblW w:w="22407" w:type="dxa"/>
+        <w:tblLayout w:type="fixed"/>
         <w:tblCellMar>
           <w:top w:w="15" w:type="dxa"/>
           <w:left w:w="15" w:type="dxa"/>
@@ -487,13 +433,13 @@
         <w:tblLook w:val="04A0" w:firstRow="1" w:lastRow="0" w:firstColumn="1" w:lastColumn="0" w:noHBand="0" w:noVBand="1"/>
       </w:tblPr>
       <w:tblGrid>
-        <w:gridCol w:w="1213"/>
-        <w:gridCol w:w="4537"/>
-        <w:gridCol w:w="5580"/>
-        <w:gridCol w:w="1620"/>
-        <w:gridCol w:w="5490"/>
-        <w:gridCol w:w="1872"/>
-        <w:gridCol w:w="2095"/>
+        <w:gridCol w:w="620"/>
+        <w:gridCol w:w="5018"/>
+        <w:gridCol w:w="6232"/>
+        <w:gridCol w:w="883"/>
+        <w:gridCol w:w="7487"/>
+        <w:gridCol w:w="1170"/>
+        <w:gridCol w:w="997"/>
       </w:tblGrid>
       <w:tr>
         <w:trPr>
@@ -502,7 +448,7 @@
         </w:trPr>
         <w:tc>
           <w:tcPr>
-            <w:tcW w:w="0" w:type="auto"/>
+            <w:tcW w:w="620" w:type="dxa"/>
             <w:tcBorders>
               <w:top w:val="single" w:sz="8" w:space="0" w:color="000000"/>
               <w:left w:val="single" w:sz="8" w:space="0" w:color="000000"/>
@@ -536,7 +482,7 @@
         </w:tc>
         <w:tc>
           <w:tcPr>
-            <w:tcW w:w="4537" w:type="dxa"/>
+            <w:tcW w:w="5018" w:type="dxa"/>
             <w:tcBorders>
               <w:top w:val="single" w:sz="8" w:space="0" w:color="000000"/>
               <w:left w:val="single" w:sz="8" w:space="0" w:color="000000"/>
@@ -570,12 +516,10 @@
         </w:tc>
         <w:tc>
           <w:tcPr>
-            <w:tcW w:w="5580" w:type="dxa"/>
+            <w:tcW w:w="6232" w:type="dxa"/>
             <w:tcBorders>
               <w:top w:val="single" w:sz="4" w:space="0" w:color="auto"/>
-              <w:left w:val="single" w:sz="4" w:space="0" w:color="auto"/>
               <w:bottom w:val="single" w:sz="4" w:space="0" w:color="auto"/>
-              <w:right w:val="single" w:sz="4" w:space="0" w:color="auto"/>
             </w:tcBorders>
             <w:shd w:val="clear" w:color="auto" w:fill="1E3765"/>
           </w:tcPr>
@@ -597,7 +541,7 @@
         </w:tc>
         <w:tc>
           <w:tcPr>
-            <w:tcW w:w="1620" w:type="dxa"/>
+            <w:tcW w:w="883" w:type="dxa"/>
             <w:tcBorders>
               <w:top w:val="single" w:sz="8" w:space="0" w:color="000000"/>
               <w:left w:val="single" w:sz="4" w:space="0" w:color="auto"/>
@@ -631,7 +575,7 @@
         </w:tc>
         <w:tc>
           <w:tcPr>
-            <w:tcW w:w="5490" w:type="dxa"/>
+            <w:tcW w:w="7487" w:type="dxa"/>
             <w:tcBorders>
               <w:top w:val="single" w:sz="8" w:space="0" w:color="000000"/>
               <w:left w:val="single" w:sz="8" w:space="0" w:color="000000"/>
@@ -665,7 +609,7 @@
         </w:tc>
         <w:tc>
           <w:tcPr>
-            <w:tcW w:w="1872" w:type="dxa"/>
+            <w:tcW w:w="1170" w:type="dxa"/>
             <w:tcBorders>
               <w:top w:val="single" w:sz="8" w:space="0" w:color="000000"/>
               <w:left w:val="single" w:sz="8" w:space="0" w:color="000000"/>
@@ -699,7 +643,7 @@
         </w:tc>
         <w:tc>
           <w:tcPr>
-            <w:tcW w:w="2095" w:type="dxa"/>
+            <w:tcW w:w="997" w:type="dxa"/>
             <w:tcBorders>
               <w:top w:val="single" w:sz="8" w:space="0" w:color="000000"/>
               <w:left w:val="single" w:sz="8" w:space="0" w:color="000000"/>
@@ -753,7 +697,7 @@
         </w:trPr>
         <w:tc>
           <w:tcPr>
-            <w:tcW w:w="0" w:type="auto"/>
+            <w:tcW w:w="620" w:type="dxa"/>
             <w:tcBorders>
               <w:top w:val="single" w:sz="8" w:space="0" w:color="000000"/>
               <w:left w:val="single" w:sz="8" w:space="0" w:color="000000"/>
@@ -822,7 +766,7 @@
         </w:tc>
         <w:tc>
           <w:tcPr>
-            <w:tcW w:w="4537" w:type="dxa"/>
+            <w:tcW w:w="5018" w:type="dxa"/>
             <w:tcBorders>
               <w:top w:val="single" w:sz="8" w:space="0" w:color="000000"/>
               <w:left w:val="single" w:sz="8" w:space="0" w:color="000000"/>
@@ -847,12 +791,10 @@
         </w:tc>
         <w:tc>
           <w:tcPr>
-            <w:tcW w:w="5580" w:type="dxa"/>
+            <w:tcW w:w="6232" w:type="dxa"/>
             <w:tcBorders>
               <w:top w:val="single" w:sz="4" w:space="0" w:color="auto"/>
-              <w:left w:val="single" w:sz="4" w:space="0" w:color="auto"/>
               <w:bottom w:val="single" w:sz="4" w:space="0" w:color="auto"/>
-              <w:right w:val="single" w:sz="4" w:space="0" w:color="auto"/>
             </w:tcBorders>
           </w:tcPr>
           <w:p>
@@ -866,7 +808,7 @@
         </w:tc>
         <w:tc>
           <w:tcPr>
-            <w:tcW w:w="1620" w:type="dxa"/>
+            <w:tcW w:w="883" w:type="dxa"/>
             <w:tcBorders>
               <w:top w:val="single" w:sz="8" w:space="0" w:color="000000"/>
               <w:left w:val="single" w:sz="4" w:space="0" w:color="auto"/>
@@ -891,7 +833,7 @@
         </w:tc>
         <w:tc>
           <w:tcPr>
-            <w:tcW w:w="5490" w:type="dxa"/>
+            <w:tcW w:w="7487" w:type="dxa"/>
             <w:tcBorders>
               <w:top w:val="single" w:sz="8" w:space="0" w:color="000000"/>
               <w:left w:val="single" w:sz="8" w:space="0" w:color="000000"/>
@@ -909,7 +851,7 @@
         </w:tc>
         <w:tc>
           <w:tcPr>
-            <w:tcW w:w="1872" w:type="dxa"/>
+            <w:tcW w:w="1170" w:type="dxa"/>
             <w:tcBorders>
               <w:top w:val="single" w:sz="8" w:space="0" w:color="000000"/>
               <w:left w:val="single" w:sz="8" w:space="0" w:color="000000"/>
@@ -927,7 +869,7 @@
         </w:tc>
         <w:tc>
           <w:tcPr>
-            <w:tcW w:w="2095" w:type="dxa"/>
+            <w:tcW w:w="997" w:type="dxa"/>
             <w:tcBorders>
               <w:top w:val="single" w:sz="8" w:space="0" w:color="000000"/>
               <w:left w:val="single" w:sz="8" w:space="0" w:color="000000"/>
@@ -950,7 +892,7 @@
         </w:trPr>
         <w:tc>
           <w:tcPr>
-            <w:tcW w:w="0" w:type="auto"/>
+            <w:tcW w:w="620" w:type="dxa"/>
             <w:tcBorders>
               <w:top w:val="single" w:sz="8" w:space="0" w:color="000000"/>
               <w:left w:val="single" w:sz="8" w:space="0" w:color="000000"/>
@@ -981,7 +923,7 @@
         </w:tc>
         <w:tc>
           <w:tcPr>
-            <w:tcW w:w="4537" w:type="dxa"/>
+            <w:tcW w:w="5018" w:type="dxa"/>
             <w:tcBorders>
               <w:top w:val="single" w:sz="8" w:space="0" w:color="000000"/>
               <w:left w:val="single" w:sz="8" w:space="0" w:color="000000"/>
@@ -997,15 +939,7 @@
           </w:tcPr>
           <w:p>
             <w:r>
-              <w:t xml:space="preserve">{{ </w:t>
-            </w:r>
-            <w:proofErr w:type="spellStart"/>
-            <w:r>
-              <w:t>item.action</w:t>
-            </w:r>
-            <w:proofErr w:type="spellEnd"/>
-            <w:r>
-              <w:t xml:space="preserve"> }}</w:t>
+              <w:t>{{ item.action }}</w:t>
             </w:r>
           </w:p>
           <w:p>
@@ -1026,126 +960,135 @@
                 <w:sz w:val="20"/>
                 <w:szCs w:val="20"/>
               </w:rPr>
-              <w:t xml:space="preserve">{{ </w:t>
-            </w:r>
-            <w:proofErr w:type="spellStart"/>
-            <w:r>
-              <w:rPr>
-                <w:i/>
-                <w:iCs/>
-                <w:color w:val="171717" w:themeColor="background2" w:themeShade="1A"/>
-                <w:sz w:val="20"/>
-                <w:szCs w:val="20"/>
-              </w:rPr>
-              <w:t>item.instructions</w:t>
-            </w:r>
-            <w:proofErr w:type="spellEnd"/>
-            <w:r>
-              <w:rPr>
-                <w:i/>
-                <w:iCs/>
-                <w:color w:val="171717" w:themeColor="background2" w:themeShade="1A"/>
-                <w:sz w:val="20"/>
-                <w:szCs w:val="20"/>
-              </w:rPr>
-              <w:t xml:space="preserve"> }}</w:t>
+              <w:t>{{ item.instructions }}</w:t>
             </w:r>
           </w:p>
         </w:tc>
         <w:tc>
           <w:tcPr>
-            <w:tcW w:w="5580" w:type="dxa"/>
+            <w:tcW w:w="6232" w:type="dxa"/>
             <w:tcBorders>
               <w:top w:val="single" w:sz="4" w:space="0" w:color="auto"/>
-              <w:left w:val="single" w:sz="4" w:space="0" w:color="auto"/>
               <w:bottom w:val="single" w:sz="4" w:space="0" w:color="auto"/>
-              <w:right w:val="single" w:sz="4" w:space="0" w:color="auto"/>
             </w:tcBorders>
           </w:tcPr>
           <w:p>
             <w:pPr>
               <w:rPr>
-                <w:rFonts w:hint="eastAsia"/>
+                <w:lang w:val="en-US"/>
               </w:rPr>
             </w:pPr>
             <w:r>
-              <w:t xml:space="preserve">{% if </w:t>
-            </w:r>
-            <w:proofErr w:type="spellStart"/>
-            <w:r>
-              <w:t>item.automated_check_results</w:t>
-            </w:r>
-            <w:proofErr w:type="spellEnd"/>
-            <w:r>
-              <w:t xml:space="preserve"> %}{% for key, values in </w:t>
-            </w:r>
-            <w:proofErr w:type="spellStart"/>
-            <w:r>
-              <w:t>item.automated_check_results.items</w:t>
-            </w:r>
-            <w:proofErr w:type="spellEnd"/>
-            <w:r>
-              <w:t>() %}</w:t>
+              <w:rPr>
+                <w:rFonts w:hint="eastAsia"/>
+                <w:highlight w:val="yellow"/>
+              </w:rPr>
+              <w:t>{</w:t>
+            </w:r>
+            <w:r>
+              <w:rPr>
+                <w:rFonts w:hint="eastAsia"/>
+                <w:highlight w:val="yellow"/>
+              </w:rPr>
+              <w:t xml:space="preserve">{ </w:t>
+            </w:r>
+            <w:r>
+              <w:rPr>
+                <w:rFonts w:hint="eastAsia"/>
+                <w:highlight w:val="yellow"/>
+              </w:rPr>
+              <w:t>item.</w:t>
+            </w:r>
+            <w:r>
+              <w:rPr>
+                <w:highlight w:val="yellow"/>
+                <w:lang w:val="en-US"/>
+              </w:rPr>
+              <w:t>check_type</w:t>
+            </w:r>
+            <w:r>
+              <w:rPr>
+                <w:rFonts w:hint="eastAsia"/>
+                <w:highlight w:val="yellow"/>
+                <w:lang w:val="en-US"/>
+              </w:rPr>
+              <w:t xml:space="preserve"> }}</w:t>
+            </w:r>
+          </w:p>
+          <w:p>
+            <w:pPr>
+              <w:rPr>
+                <w:rFonts w:hint="eastAsia"/>
+                <w:lang w:val="en-US"/>
+              </w:rPr>
+            </w:pPr>
+            <w:r>
+              <w:rPr>
+                <w:rFonts w:hint="eastAsia"/>
+                <w:lang w:val="en-US"/>
+              </w:rPr>
+              <w:t>{{ item.</w:t>
+            </w:r>
+            <w:r>
+              <w:rPr>
+                <w:lang w:val="en-US"/>
+              </w:rPr>
+              <w:t>information_location</w:t>
+            </w:r>
+            <w:r>
+              <w:rPr>
+                <w:rFonts w:hint="eastAsia"/>
+                <w:lang w:val="en-US"/>
+              </w:rPr>
+              <w:t xml:space="preserve"> }}</w:t>
+            </w:r>
+          </w:p>
+          <w:p>
+            <w:pPr>
+              <w:rPr>
+                <w:rFonts w:hint="eastAsia"/>
+                <w:highlight w:val="yellow"/>
+              </w:rPr>
+            </w:pPr>
+            <w:r>
+              <w:t>{% if item.automated_check_results %}{% for key, values in item.automated_check_results.items() %}</w:t>
             </w:r>
             <w:r>
               <w:br/>
             </w:r>
             <w:r>
-              <w:t>{{ key }}:{% if values %}{% for v in values %}</w:t>
+              <w:rPr>
+                <w:b/>
+                <w:bCs/>
+              </w:rPr>
+              <w:t>{{ key }}</w:t>
+            </w:r>
+            <w:r>
+              <w:t>:{% if values %}{% for v in values %}</w:t>
             </w:r>
             <w:r>
               <w:br/>
             </w:r>
             <w:r>
-              <w:t xml:space="preserve">{{ </w:t>
-            </w:r>
-            <w:proofErr w:type="spellStart"/>
-            <w:r>
-              <w:t>loop.index</w:t>
-            </w:r>
-            <w:proofErr w:type="spellEnd"/>
-            <w:r>
-              <w:t xml:space="preserve"> }}. {{ v }}</w:t>
-            </w:r>
-            <w:r>
-              <w:t xml:space="preserve">{% </w:t>
-            </w:r>
-            <w:proofErr w:type="spellStart"/>
-            <w:r>
-              <w:t>endfor</w:t>
-            </w:r>
-            <w:proofErr w:type="spellEnd"/>
-            <w:r>
-              <w:t xml:space="preserve"> %}{% else %}</w:t>
+              <w:t>{{ loop.index }}. {{ v }}</w:t>
+            </w:r>
+            <w:r>
+              <w:t>{% endfor %}{% else %}</w:t>
             </w:r>
             <w:r>
               <w:rPr>
                 <w:rFonts w:hint="eastAsia"/>
               </w:rPr>
-              <w:t xml:space="preserve"> </w:t>
-            </w:r>
-            <w:r>
-              <w:rPr>
-                <w:rFonts w:hint="eastAsia"/>
-              </w:rPr>
-              <w:t>None</w:t>
-            </w:r>
-            <w:r>
-              <w:t xml:space="preserve">{% endif %}{% </w:t>
-            </w:r>
-            <w:proofErr w:type="spellStart"/>
-            <w:r>
-              <w:t>endfor</w:t>
-            </w:r>
-            <w:proofErr w:type="spellEnd"/>
-            <w:r>
-              <w:t xml:space="preserve"> %}{% endif %}</w:t>
+              <w:t xml:space="preserve"> None</w:t>
+            </w:r>
+            <w:r>
+              <w:t>{% endif %}{% endfor %}{% endif %}</w:t>
             </w:r>
           </w:p>
         </w:tc>
         <w:tc>
           <w:tcPr>
-            <w:tcW w:w="1620" w:type="dxa"/>
+            <w:tcW w:w="883" w:type="dxa"/>
             <w:tcBorders>
               <w:top w:val="single" w:sz="8" w:space="0" w:color="000000"/>
               <w:left w:val="single" w:sz="4" w:space="0" w:color="auto"/>
@@ -1161,16 +1104,11 @@
           </w:tcPr>
           <w:p>
             <w:r>
-              <w:t xml:space="preserve">{{ </w:t>
-            </w:r>
-            <w:proofErr w:type="spellStart"/>
-            <w:r>
-              <w:t>item.</w:t>
+              <w:t>{{ item.</w:t>
             </w:r>
             <w:r>
               <w:t>status</w:t>
             </w:r>
-            <w:proofErr w:type="spellEnd"/>
             <w:r>
               <w:t>}}</w:t>
             </w:r>
@@ -1178,7 +1116,7 @@
         </w:tc>
         <w:tc>
           <w:tcPr>
-            <w:tcW w:w="5490" w:type="dxa"/>
+            <w:tcW w:w="7487" w:type="dxa"/>
             <w:tcBorders>
               <w:top w:val="single" w:sz="8" w:space="0" w:color="000000"/>
               <w:left w:val="single" w:sz="8" w:space="0" w:color="000000"/>
@@ -1194,16 +1132,11 @@
           </w:tcPr>
           <w:p>
             <w:r>
-              <w:t xml:space="preserve">{{ </w:t>
-            </w:r>
-            <w:proofErr w:type="spellStart"/>
-            <w:r>
-              <w:t>item.</w:t>
+              <w:t>{{ item.</w:t>
             </w:r>
             <w:r>
               <w:t>comments</w:t>
             </w:r>
-            <w:proofErr w:type="spellEnd"/>
             <w:r>
               <w:t xml:space="preserve"> </w:t>
             </w:r>
@@ -1214,7 +1147,7 @@
         </w:tc>
         <w:tc>
           <w:tcPr>
-            <w:tcW w:w="1872" w:type="dxa"/>
+            <w:tcW w:w="1170" w:type="dxa"/>
             <w:tcBorders>
               <w:top w:val="single" w:sz="8" w:space="0" w:color="000000"/>
               <w:left w:val="single" w:sz="8" w:space="0" w:color="000000"/>
@@ -1241,21 +1174,13 @@
               <w:t>{</w:t>
             </w:r>
             <w:r>
-              <w:t xml:space="preserve">{ </w:t>
-            </w:r>
-            <w:proofErr w:type="spellStart"/>
-            <w:r>
-              <w:t>item.priority</w:t>
-            </w:r>
-            <w:proofErr w:type="spellEnd"/>
-            <w:r>
-              <w:t xml:space="preserve"> }}</w:t>
+              <w:t>{ item.priority }}</w:t>
             </w:r>
           </w:p>
         </w:tc>
         <w:tc>
           <w:tcPr>
-            <w:tcW w:w="2095" w:type="dxa"/>
+            <w:tcW w:w="997" w:type="dxa"/>
             <w:tcBorders>
               <w:top w:val="single" w:sz="8" w:space="0" w:color="000000"/>
               <w:left w:val="single" w:sz="8" w:space="0" w:color="000000"/>
@@ -1287,14 +1212,12 @@
             <w:r>
               <w:t>item.</w:t>
             </w:r>
-            <w:proofErr w:type="spellStart"/>
             <w:r>
               <w:rPr>
                 <w:lang w:val="en-US"/>
               </w:rPr>
               <w:t>time_spent</w:t>
             </w:r>
-            <w:proofErr w:type="spellEnd"/>
             <w:r>
               <w:t xml:space="preserve"> }}</w:t>
             </w:r>
@@ -1307,7 +1230,7 @@
         </w:trPr>
         <w:tc>
           <w:tcPr>
-            <w:tcW w:w="0" w:type="auto"/>
+            <w:tcW w:w="620" w:type="dxa"/>
             <w:tcBorders>
               <w:top w:val="single" w:sz="8" w:space="0" w:color="000000"/>
               <w:left w:val="single" w:sz="8" w:space="0" w:color="000000"/>
@@ -1354,7 +1277,7 @@
         </w:tc>
         <w:tc>
           <w:tcPr>
-            <w:tcW w:w="4537" w:type="dxa"/>
+            <w:tcW w:w="5018" w:type="dxa"/>
             <w:tcBorders>
               <w:top w:val="single" w:sz="8" w:space="0" w:color="000000"/>
               <w:left w:val="single" w:sz="8" w:space="0" w:color="000000"/>
@@ -1379,12 +1302,10 @@
         </w:tc>
         <w:tc>
           <w:tcPr>
-            <w:tcW w:w="5580" w:type="dxa"/>
+            <w:tcW w:w="6232" w:type="dxa"/>
             <w:tcBorders>
               <w:top w:val="single" w:sz="4" w:space="0" w:color="auto"/>
-              <w:left w:val="single" w:sz="4" w:space="0" w:color="auto"/>
               <w:bottom w:val="single" w:sz="4" w:space="0" w:color="auto"/>
-              <w:right w:val="single" w:sz="4" w:space="0" w:color="auto"/>
             </w:tcBorders>
           </w:tcPr>
           <w:p>
@@ -1398,7 +1319,7 @@
         </w:tc>
         <w:tc>
           <w:tcPr>
-            <w:tcW w:w="1620" w:type="dxa"/>
+            <w:tcW w:w="883" w:type="dxa"/>
             <w:tcBorders>
               <w:top w:val="single" w:sz="8" w:space="0" w:color="000000"/>
               <w:left w:val="single" w:sz="4" w:space="0" w:color="auto"/>
@@ -1423,7 +1344,7 @@
         </w:tc>
         <w:tc>
           <w:tcPr>
-            <w:tcW w:w="5490" w:type="dxa"/>
+            <w:tcW w:w="7487" w:type="dxa"/>
             <w:tcBorders>
               <w:top w:val="single" w:sz="8" w:space="0" w:color="000000"/>
               <w:left w:val="single" w:sz="8" w:space="0" w:color="000000"/>
@@ -1441,7 +1362,7 @@
         </w:tc>
         <w:tc>
           <w:tcPr>
-            <w:tcW w:w="1872" w:type="dxa"/>
+            <w:tcW w:w="1170" w:type="dxa"/>
             <w:tcBorders>
               <w:top w:val="single" w:sz="8" w:space="0" w:color="000000"/>
               <w:left w:val="single" w:sz="8" w:space="0" w:color="000000"/>
@@ -1459,7 +1380,7 @@
         </w:tc>
         <w:tc>
           <w:tcPr>
-            <w:tcW w:w="2095" w:type="dxa"/>
+            <w:tcW w:w="997" w:type="dxa"/>
             <w:tcBorders>
               <w:top w:val="single" w:sz="8" w:space="0" w:color="000000"/>
               <w:left w:val="single" w:sz="8" w:space="0" w:color="000000"/>

</xml_diff>

<commit_message>
fix: mapping of the checklist table and word template
</commit_message>
<xml_diff>
--- a/res/curation_log_template.docx
+++ b/res/curation_log_template.docx
@@ -78,7 +78,14 @@
                 <w:b/>
                 <w:bCs/>
               </w:rPr>
-              <w:t>Ticket number:</w:t>
+              <w:t>Project</w:t>
+            </w:r>
+            <w:r>
+              <w:rPr>
+                <w:b/>
+                <w:bCs/>
+              </w:rPr>
+              <w:t xml:space="preserve"> number:</w:t>
             </w:r>
             <w:r>
               <w:t xml:space="preserve"> {{ </w:t>
@@ -87,7 +94,13 @@
               <w:t>project_metadata</w:t>
             </w:r>
             <w:r>
-              <w:t>.ticket_number }}</w:t>
+              <w:t>.</w:t>
+            </w:r>
+            <w:r>
+              <w:t>project</w:t>
+            </w:r>
+            <w:r>
+              <w:t>_number }}</w:t>
             </w:r>
           </w:p>
         </w:tc>
@@ -318,7 +331,28 @@
                 <w:b/>
                 <w:bCs/>
               </w:rPr>
-              <w:t>Dataset ID (versioned):</w:t>
+              <w:t xml:space="preserve">Dataset </w:t>
+            </w:r>
+            <w:r>
+              <w:rPr>
+                <w:b/>
+                <w:bCs/>
+              </w:rPr>
+              <w:t>p</w:t>
+            </w:r>
+            <w:r>
+              <w:rPr>
+                <w:b/>
+                <w:bCs/>
+              </w:rPr>
+              <w:t>ath</w:t>
+            </w:r>
+            <w:r>
+              <w:rPr>
+                <w:b/>
+                <w:bCs/>
+              </w:rPr>
+              <w:t>:</w:t>
             </w:r>
             <w:r>
               <w:t xml:space="preserve"> {{</w:t>
@@ -434,11 +468,11 @@
       </w:tblPr>
       <w:tblGrid>
         <w:gridCol w:w="620"/>
-        <w:gridCol w:w="5018"/>
-        <w:gridCol w:w="6232"/>
-        <w:gridCol w:w="883"/>
-        <w:gridCol w:w="7487"/>
-        <w:gridCol w:w="1170"/>
+        <w:gridCol w:w="6883"/>
+        <w:gridCol w:w="3260"/>
+        <w:gridCol w:w="3261"/>
+        <w:gridCol w:w="5528"/>
+        <w:gridCol w:w="1858"/>
         <w:gridCol w:w="997"/>
       </w:tblGrid>
       <w:tr>
@@ -482,7 +516,7 @@
         </w:tc>
         <w:tc>
           <w:tcPr>
-            <w:tcW w:w="5018" w:type="dxa"/>
+            <w:tcW w:w="6883" w:type="dxa"/>
             <w:tcBorders>
               <w:top w:val="single" w:sz="8" w:space="0" w:color="000000"/>
               <w:left w:val="single" w:sz="8" w:space="0" w:color="000000"/>
@@ -516,7 +550,7 @@
         </w:tc>
         <w:tc>
           <w:tcPr>
-            <w:tcW w:w="6232" w:type="dxa"/>
+            <w:tcW w:w="3260" w:type="dxa"/>
             <w:tcBorders>
               <w:top w:val="single" w:sz="4" w:space="0" w:color="auto"/>
               <w:bottom w:val="single" w:sz="4" w:space="0" w:color="auto"/>
@@ -535,13 +569,13 @@
                 <w:b/>
                 <w:bCs/>
               </w:rPr>
-              <w:t>Check Type, Tool Checklist and Results (if Applicable), Curator Checklist</w:t>
+              <w:t>Information Location</w:t>
             </w:r>
           </w:p>
         </w:tc>
         <w:tc>
           <w:tcPr>
-            <w:tcW w:w="883" w:type="dxa"/>
+            <w:tcW w:w="3261" w:type="dxa"/>
             <w:tcBorders>
               <w:top w:val="single" w:sz="8" w:space="0" w:color="000000"/>
               <w:left w:val="single" w:sz="4" w:space="0" w:color="auto"/>
@@ -569,13 +603,13 @@
                 <w:b/>
                 <w:bCs/>
               </w:rPr>
-              <w:t>Status</w:t>
+              <w:t>Priority</w:t>
             </w:r>
           </w:p>
         </w:tc>
         <w:tc>
           <w:tcPr>
-            <w:tcW w:w="7487" w:type="dxa"/>
+            <w:tcW w:w="5528" w:type="dxa"/>
             <w:tcBorders>
               <w:top w:val="single" w:sz="8" w:space="0" w:color="000000"/>
               <w:left w:val="single" w:sz="8" w:space="0" w:color="000000"/>
@@ -609,7 +643,7 @@
         </w:tc>
         <w:tc>
           <w:tcPr>
-            <w:tcW w:w="1170" w:type="dxa"/>
+            <w:tcW w:w="1858" w:type="dxa"/>
             <w:tcBorders>
               <w:top w:val="single" w:sz="8" w:space="0" w:color="000000"/>
               <w:left w:val="single" w:sz="8" w:space="0" w:color="000000"/>
@@ -637,7 +671,7 @@
                 <w:b/>
                 <w:bCs/>
               </w:rPr>
-              <w:t>Priority</w:t>
+              <w:t>Status</w:t>
             </w:r>
           </w:p>
         </w:tc>
@@ -766,7 +800,7 @@
         </w:tc>
         <w:tc>
           <w:tcPr>
-            <w:tcW w:w="5018" w:type="dxa"/>
+            <w:tcW w:w="6883" w:type="dxa"/>
             <w:tcBorders>
               <w:top w:val="single" w:sz="8" w:space="0" w:color="000000"/>
               <w:left w:val="single" w:sz="8" w:space="0" w:color="000000"/>
@@ -791,7 +825,7 @@
         </w:tc>
         <w:tc>
           <w:tcPr>
-            <w:tcW w:w="6232" w:type="dxa"/>
+            <w:tcW w:w="3260" w:type="dxa"/>
             <w:tcBorders>
               <w:top w:val="single" w:sz="4" w:space="0" w:color="auto"/>
               <w:bottom w:val="single" w:sz="4" w:space="0" w:color="auto"/>
@@ -808,7 +842,7 @@
         </w:tc>
         <w:tc>
           <w:tcPr>
-            <w:tcW w:w="883" w:type="dxa"/>
+            <w:tcW w:w="3261" w:type="dxa"/>
             <w:tcBorders>
               <w:top w:val="single" w:sz="8" w:space="0" w:color="000000"/>
               <w:left w:val="single" w:sz="4" w:space="0" w:color="auto"/>
@@ -833,7 +867,7 @@
         </w:tc>
         <w:tc>
           <w:tcPr>
-            <w:tcW w:w="7487" w:type="dxa"/>
+            <w:tcW w:w="5528" w:type="dxa"/>
             <w:tcBorders>
               <w:top w:val="single" w:sz="8" w:space="0" w:color="000000"/>
               <w:left w:val="single" w:sz="8" w:space="0" w:color="000000"/>
@@ -851,7 +885,7 @@
         </w:tc>
         <w:tc>
           <w:tcPr>
-            <w:tcW w:w="1170" w:type="dxa"/>
+            <w:tcW w:w="1858" w:type="dxa"/>
             <w:tcBorders>
               <w:top w:val="single" w:sz="8" w:space="0" w:color="000000"/>
               <w:left w:val="single" w:sz="8" w:space="0" w:color="000000"/>
@@ -923,7 +957,7 @@
         </w:tc>
         <w:tc>
           <w:tcPr>
-            <w:tcW w:w="5018" w:type="dxa"/>
+            <w:tcW w:w="6883" w:type="dxa"/>
             <w:tcBorders>
               <w:top w:val="single" w:sz="8" w:space="0" w:color="000000"/>
               <w:left w:val="single" w:sz="8" w:space="0" w:color="000000"/>
@@ -966,7 +1000,7 @@
         </w:tc>
         <w:tc>
           <w:tcPr>
-            <w:tcW w:w="6232" w:type="dxa"/>
+            <w:tcW w:w="3260" w:type="dxa"/>
             <w:tcBorders>
               <w:top w:val="single" w:sz="4" w:space="0" w:color="auto"/>
               <w:bottom w:val="single" w:sz="4" w:space="0" w:color="auto"/>
@@ -1018,7 +1052,6 @@
           <w:p>
             <w:pPr>
               <w:rPr>
-                <w:rFonts w:hint="eastAsia"/>
                 <w:lang w:val="en-US"/>
               </w:rPr>
             </w:pPr>
@@ -1046,7 +1079,6 @@
           <w:p>
             <w:pPr>
               <w:rPr>
-                <w:rFonts w:hint="eastAsia"/>
                 <w:highlight w:val="yellow"/>
               </w:rPr>
             </w:pPr>
@@ -1088,7 +1120,7 @@
         </w:tc>
         <w:tc>
           <w:tcPr>
-            <w:tcW w:w="883" w:type="dxa"/>
+            <w:tcW w:w="3261" w:type="dxa"/>
             <w:tcBorders>
               <w:top w:val="single" w:sz="8" w:space="0" w:color="000000"/>
               <w:left w:val="single" w:sz="4" w:space="0" w:color="auto"/>
@@ -1104,19 +1136,19 @@
           </w:tcPr>
           <w:p>
             <w:r>
-              <w:t>{{ item.</w:t>
-            </w:r>
-            <w:r>
-              <w:t>status</w:t>
-            </w:r>
-            <w:r>
-              <w:t>}}</w:t>
+              <w:rPr>
+                <w:rFonts w:hint="eastAsia"/>
+              </w:rPr>
+              <w:t>{</w:t>
+            </w:r>
+            <w:r>
+              <w:t>{ item.priority }}</w:t>
             </w:r>
           </w:p>
         </w:tc>
         <w:tc>
           <w:tcPr>
-            <w:tcW w:w="7487" w:type="dxa"/>
+            <w:tcW w:w="5528" w:type="dxa"/>
             <w:tcBorders>
               <w:top w:val="single" w:sz="8" w:space="0" w:color="000000"/>
               <w:left w:val="single" w:sz="8" w:space="0" w:color="000000"/>
@@ -1147,7 +1179,7 @@
         </w:tc>
         <w:tc>
           <w:tcPr>
-            <w:tcW w:w="1170" w:type="dxa"/>
+            <w:tcW w:w="1858" w:type="dxa"/>
             <w:tcBorders>
               <w:top w:val="single" w:sz="8" w:space="0" w:color="000000"/>
               <w:left w:val="single" w:sz="8" w:space="0" w:color="000000"/>
@@ -1169,12 +1201,9 @@
             </w:pPr>
             <w:r>
               <w:rPr>
-                <w:rFonts w:hint="eastAsia"/>
+                <w:lang w:val="en-US"/>
               </w:rPr>
-              <w:t>{</w:t>
-            </w:r>
-            <w:r>
-              <w:t>{ item.priority }}</w:t>
+              <w:t xml:space="preserve">{{ item.status}} </w:t>
             </w:r>
           </w:p>
         </w:tc>
@@ -1277,7 +1306,7 @@
         </w:tc>
         <w:tc>
           <w:tcPr>
-            <w:tcW w:w="5018" w:type="dxa"/>
+            <w:tcW w:w="6883" w:type="dxa"/>
             <w:tcBorders>
               <w:top w:val="single" w:sz="8" w:space="0" w:color="000000"/>
               <w:left w:val="single" w:sz="8" w:space="0" w:color="000000"/>
@@ -1302,7 +1331,7 @@
         </w:tc>
         <w:tc>
           <w:tcPr>
-            <w:tcW w:w="6232" w:type="dxa"/>
+            <w:tcW w:w="3260" w:type="dxa"/>
             <w:tcBorders>
               <w:top w:val="single" w:sz="4" w:space="0" w:color="auto"/>
               <w:bottom w:val="single" w:sz="4" w:space="0" w:color="auto"/>
@@ -1319,7 +1348,7 @@
         </w:tc>
         <w:tc>
           <w:tcPr>
-            <w:tcW w:w="883" w:type="dxa"/>
+            <w:tcW w:w="3261" w:type="dxa"/>
             <w:tcBorders>
               <w:top w:val="single" w:sz="8" w:space="0" w:color="000000"/>
               <w:left w:val="single" w:sz="4" w:space="0" w:color="auto"/>
@@ -1344,7 +1373,7 @@
         </w:tc>
         <w:tc>
           <w:tcPr>
-            <w:tcW w:w="7487" w:type="dxa"/>
+            <w:tcW w:w="5528" w:type="dxa"/>
             <w:tcBorders>
               <w:top w:val="single" w:sz="8" w:space="0" w:color="000000"/>
               <w:left w:val="single" w:sz="8" w:space="0" w:color="000000"/>
@@ -1362,7 +1391,7 @@
         </w:tc>
         <w:tc>
           <w:tcPr>
-            <w:tcW w:w="1170" w:type="dxa"/>
+            <w:tcW w:w="1858" w:type="dxa"/>
             <w:tcBorders>
               <w:top w:val="single" w:sz="8" w:space="0" w:color="000000"/>
               <w:left w:val="single" w:sz="8" w:space="0" w:color="000000"/>
@@ -8540,6 +8569,7 @@
   <w:style w:type="character" w:default="1" w:styleId="DefaultParagraphFont">
     <w:name w:val="Default Paragraph Font"/>
     <w:uiPriority w:val="1"/>
+    <w:semiHidden/>
     <w:unhideWhenUsed/>
   </w:style>
   <w:style w:type="table" w:default="1" w:styleId="TableNormal">

</xml_diff>

<commit_message>
Fix/441 word template (#450)
* fix: mapping of the checklist table and word template

* fix: table width

* fix: watch issue
</commit_message>
<xml_diff>
--- a/res/curation_log_template.docx
+++ b/res/curation_log_template.docx
@@ -78,16 +78,47 @@
                 <w:b/>
                 <w:bCs/>
               </w:rPr>
-              <w:t>Ticket number:</w:t>
-            </w:r>
-            <w:r>
-              <w:t xml:space="preserve"> {{ </w:t>
-            </w:r>
-            <w:r>
-              <w:t>project_metadata</w:t>
-            </w:r>
-            <w:r>
-              <w:t>.ticket_number }}</w:t>
+              <w:t>Project</w:t>
+            </w:r>
+            <w:r>
+              <w:rPr>
+                <w:b/>
+                <w:bCs/>
+              </w:rPr>
+              <w:t xml:space="preserve"> number:</w:t>
+            </w:r>
+            <w:r>
+              <w:t xml:space="preserve"> </w:t>
+            </w:r>
+            <w:proofErr w:type="gramStart"/>
+            <w:r>
+              <w:t xml:space="preserve">{{ </w:t>
+            </w:r>
+            <w:proofErr w:type="spellStart"/>
+            <w:r>
+              <w:t>project</w:t>
+            </w:r>
+            <w:proofErr w:type="gramEnd"/>
+            <w:r>
+              <w:t>_</w:t>
+            </w:r>
+            <w:proofErr w:type="gramStart"/>
+            <w:r>
+              <w:t>metadata</w:t>
+            </w:r>
+            <w:r>
+              <w:t>.</w:t>
+            </w:r>
+            <w:r>
+              <w:t>project</w:t>
+            </w:r>
+            <w:proofErr w:type="gramEnd"/>
+            <w:r>
+              <w:t>_number</w:t>
+            </w:r>
+            <w:proofErr w:type="spellEnd"/>
+            <w:r>
+              <w:t xml:space="preserve"> }}</w:t>
             </w:r>
           </w:p>
         </w:tc>
@@ -107,13 +138,34 @@
               <w:t>Curator name:</w:t>
             </w:r>
             <w:r>
-              <w:t xml:space="preserve"> {{ </w:t>
-            </w:r>
-            <w:r>
-              <w:t>project_metadata</w:t>
-            </w:r>
-            <w:r>
-              <w:t>.curator_name }}</w:t>
+              <w:t xml:space="preserve"> </w:t>
+            </w:r>
+            <w:proofErr w:type="gramStart"/>
+            <w:r>
+              <w:t xml:space="preserve">{{ </w:t>
+            </w:r>
+            <w:proofErr w:type="spellStart"/>
+            <w:r>
+              <w:t>project</w:t>
+            </w:r>
+            <w:proofErr w:type="gramEnd"/>
+            <w:r>
+              <w:t>_</w:t>
+            </w:r>
+            <w:proofErr w:type="gramStart"/>
+            <w:r>
+              <w:t>metadata</w:t>
+            </w:r>
+            <w:r>
+              <w:t>.curator</w:t>
+            </w:r>
+            <w:proofErr w:type="gramEnd"/>
+            <w:r>
+              <w:t>_name</w:t>
+            </w:r>
+            <w:proofErr w:type="spellEnd"/>
+            <w:r>
+              <w:t xml:space="preserve"> }}</w:t>
             </w:r>
           </w:p>
         </w:tc>
@@ -135,13 +187,34 @@
               <w:t>Curator email:</w:t>
             </w:r>
             <w:r>
-              <w:t xml:space="preserve"> {{ </w:t>
-            </w:r>
-            <w:r>
-              <w:t>project_metadata</w:t>
-            </w:r>
-            <w:r>
-              <w:t>.curator_email }}</w:t>
+              <w:t xml:space="preserve"> </w:t>
+            </w:r>
+            <w:proofErr w:type="gramStart"/>
+            <w:r>
+              <w:t xml:space="preserve">{{ </w:t>
+            </w:r>
+            <w:proofErr w:type="spellStart"/>
+            <w:r>
+              <w:t>project</w:t>
+            </w:r>
+            <w:proofErr w:type="gramEnd"/>
+            <w:r>
+              <w:t>_</w:t>
+            </w:r>
+            <w:proofErr w:type="gramStart"/>
+            <w:r>
+              <w:t>metadata</w:t>
+            </w:r>
+            <w:r>
+              <w:t>.curator</w:t>
+            </w:r>
+            <w:proofErr w:type="gramEnd"/>
+            <w:r>
+              <w:t>_email</w:t>
+            </w:r>
+            <w:proofErr w:type="spellEnd"/>
+            <w:r>
+              <w:t xml:space="preserve"> }}</w:t>
             </w:r>
           </w:p>
         </w:tc>
@@ -164,20 +237,43 @@
               <w:t>Dataset title:</w:t>
             </w:r>
             <w:r>
-              <w:t xml:space="preserve"> {{ </w:t>
-            </w:r>
-            <w:r>
-              <w:t>project_metadata</w:t>
-            </w:r>
+              <w:t xml:space="preserve"> </w:t>
+            </w:r>
+            <w:proofErr w:type="gramStart"/>
+            <w:r>
+              <w:t xml:space="preserve">{{ </w:t>
+            </w:r>
+            <w:proofErr w:type="spellStart"/>
+            <w:r>
+              <w:t>project</w:t>
+            </w:r>
+            <w:proofErr w:type="gramEnd"/>
+            <w:r>
+              <w:t>_</w:t>
+            </w:r>
+            <w:proofErr w:type="gramStart"/>
+            <w:r>
+              <w:t>metadata</w:t>
+            </w:r>
+            <w:proofErr w:type="spellEnd"/>
             <w:r>
               <w:t>.</w:t>
             </w:r>
+            <w:proofErr w:type="spellStart"/>
             <w:r>
               <w:rPr>
                 <w:lang w:val="en-US"/>
               </w:rPr>
-              <w:t>dataset_title</w:t>
-            </w:r>
+              <w:t>dataset</w:t>
+            </w:r>
+            <w:proofErr w:type="gramEnd"/>
+            <w:r>
+              <w:rPr>
+                <w:lang w:val="en-US"/>
+              </w:rPr>
+              <w:t>_title</w:t>
+            </w:r>
+            <w:proofErr w:type="spellEnd"/>
             <w:r>
               <w:t xml:space="preserve"> }}</w:t>
             </w:r>
@@ -204,20 +300,43 @@
               <w:t>Dataset persistent identifier:</w:t>
             </w:r>
             <w:r>
-              <w:t xml:space="preserve"> {{ </w:t>
-            </w:r>
-            <w:r>
-              <w:t>project_metadata</w:t>
-            </w:r>
+              <w:t xml:space="preserve"> </w:t>
+            </w:r>
+            <w:proofErr w:type="gramStart"/>
+            <w:r>
+              <w:t xml:space="preserve">{{ </w:t>
+            </w:r>
+            <w:proofErr w:type="spellStart"/>
+            <w:r>
+              <w:t>project</w:t>
+            </w:r>
+            <w:proofErr w:type="gramEnd"/>
+            <w:r>
+              <w:t>_</w:t>
+            </w:r>
+            <w:proofErr w:type="gramStart"/>
+            <w:r>
+              <w:t>metadata</w:t>
+            </w:r>
+            <w:proofErr w:type="spellEnd"/>
             <w:r>
               <w:t>.</w:t>
             </w:r>
+            <w:proofErr w:type="spellStart"/>
             <w:r>
               <w:rPr>
                 <w:lang w:val="en-US"/>
               </w:rPr>
-              <w:t>dataset_pid</w:t>
-            </w:r>
+              <w:t>dataset</w:t>
+            </w:r>
+            <w:proofErr w:type="gramEnd"/>
+            <w:r>
+              <w:rPr>
+                <w:lang w:val="en-US"/>
+              </w:rPr>
+              <w:t>_pid</w:t>
+            </w:r>
+            <w:proofErr w:type="spellEnd"/>
             <w:r>
               <w:t xml:space="preserve"> }}</w:t>
             </w:r>
@@ -242,20 +361,46 @@
               <w:t>Dataset ID (versioned):</w:t>
             </w:r>
             <w:r>
-              <w:t xml:space="preserve"> {{</w:t>
-            </w:r>
-            <w:r>
-              <w:t xml:space="preserve"> project_metadata</w:t>
-            </w:r>
+              <w:t xml:space="preserve"> </w:t>
+            </w:r>
+            <w:proofErr w:type="gramStart"/>
+            <w:r>
+              <w:t>{{</w:t>
+            </w:r>
+            <w:r>
+              <w:t xml:space="preserve"> </w:t>
+            </w:r>
+            <w:proofErr w:type="spellStart"/>
+            <w:r>
+              <w:t>project</w:t>
+            </w:r>
+            <w:proofErr w:type="gramEnd"/>
+            <w:r>
+              <w:t>_</w:t>
+            </w:r>
+            <w:proofErr w:type="gramStart"/>
+            <w:r>
+              <w:t>metadata</w:t>
+            </w:r>
+            <w:proofErr w:type="spellEnd"/>
             <w:r>
               <w:t>.</w:t>
             </w:r>
+            <w:proofErr w:type="spellStart"/>
             <w:r>
               <w:rPr>
                 <w:lang w:val="en-US"/>
               </w:rPr>
-              <w:t>dataset_id</w:t>
-            </w:r>
+              <w:t>dataset</w:t>
+            </w:r>
+            <w:proofErr w:type="gramEnd"/>
+            <w:r>
+              <w:rPr>
+                <w:lang w:val="en-US"/>
+              </w:rPr>
+              <w:t>_id</w:t>
+            </w:r>
+            <w:proofErr w:type="spellEnd"/>
             <w:r>
               <w:t xml:space="preserve"> }}</w:t>
             </w:r>
@@ -282,20 +427,46 @@
               <w:t>Dataset access URL:</w:t>
             </w:r>
             <w:r>
-              <w:t xml:space="preserve"> {{</w:t>
-            </w:r>
-            <w:r>
-              <w:t xml:space="preserve"> project_metadata</w:t>
-            </w:r>
+              <w:t xml:space="preserve"> </w:t>
+            </w:r>
+            <w:proofErr w:type="gramStart"/>
+            <w:r>
+              <w:t>{{</w:t>
+            </w:r>
+            <w:r>
+              <w:t xml:space="preserve"> </w:t>
+            </w:r>
+            <w:proofErr w:type="spellStart"/>
+            <w:r>
+              <w:t>project</w:t>
+            </w:r>
+            <w:proofErr w:type="gramEnd"/>
+            <w:r>
+              <w:t>_</w:t>
+            </w:r>
+            <w:proofErr w:type="gramStart"/>
+            <w:r>
+              <w:t>metadata</w:t>
+            </w:r>
+            <w:proofErr w:type="spellEnd"/>
             <w:r>
               <w:t>.</w:t>
             </w:r>
+            <w:proofErr w:type="spellStart"/>
             <w:r>
               <w:rPr>
                 <w:lang w:val="en-US"/>
               </w:rPr>
-              <w:t>dataset_url</w:t>
-            </w:r>
+              <w:t>dataset</w:t>
+            </w:r>
+            <w:proofErr w:type="gramEnd"/>
+            <w:r>
+              <w:rPr>
+                <w:lang w:val="en-US"/>
+              </w:rPr>
+              <w:t>_url</w:t>
+            </w:r>
+            <w:proofErr w:type="spellEnd"/>
             <w:r>
               <w:t xml:space="preserve"> }}</w:t>
             </w:r>
@@ -318,24 +489,72 @@
                 <w:b/>
                 <w:bCs/>
               </w:rPr>
-              <w:t>Dataset ID (versioned):</w:t>
-            </w:r>
-            <w:r>
-              <w:t xml:space="preserve"> {{</w:t>
-            </w:r>
-            <w:r>
-              <w:t xml:space="preserve"> project_metadata</w:t>
-            </w:r>
+              <w:t xml:space="preserve">Dataset </w:t>
+            </w:r>
+            <w:r>
+              <w:rPr>
+                <w:b/>
+                <w:bCs/>
+              </w:rPr>
+              <w:t>p</w:t>
+            </w:r>
+            <w:r>
+              <w:rPr>
+                <w:b/>
+                <w:bCs/>
+              </w:rPr>
+              <w:t>ath</w:t>
+            </w:r>
+            <w:r>
+              <w:rPr>
+                <w:b/>
+                <w:bCs/>
+              </w:rPr>
+              <w:t>:</w:t>
+            </w:r>
+            <w:r>
+              <w:t xml:space="preserve"> </w:t>
+            </w:r>
+            <w:proofErr w:type="gramStart"/>
+            <w:r>
+              <w:t>{{</w:t>
+            </w:r>
+            <w:r>
+              <w:t xml:space="preserve"> </w:t>
+            </w:r>
+            <w:proofErr w:type="spellStart"/>
+            <w:r>
+              <w:t>project</w:t>
+            </w:r>
+            <w:proofErr w:type="gramEnd"/>
+            <w:r>
+              <w:t>_</w:t>
+            </w:r>
+            <w:proofErr w:type="gramStart"/>
+            <w:r>
+              <w:t>metadata</w:t>
+            </w:r>
+            <w:proofErr w:type="spellEnd"/>
             <w:r>
               <w:t>.</w:t>
             </w:r>
+            <w:proofErr w:type="spellStart"/>
             <w:r>
               <w:rPr>
                 <w:rFonts w:hint="eastAsia"/>
                 <w:lang w:val="en-US"/>
               </w:rPr>
-              <w:t>dataset_path</w:t>
-            </w:r>
+              <w:t>dataset</w:t>
+            </w:r>
+            <w:proofErr w:type="gramEnd"/>
+            <w:r>
+              <w:rPr>
+                <w:rFonts w:hint="eastAsia"/>
+                <w:lang w:val="en-US"/>
+              </w:rPr>
+              <w:t>_path</w:t>
+            </w:r>
+            <w:proofErr w:type="spellEnd"/>
             <w:r>
               <w:t xml:space="preserve"> }}</w:t>
             </w:r>
@@ -362,17 +581,35 @@
               <w:t>Log initial generated date:</w:t>
             </w:r>
             <w:r>
-              <w:t xml:space="preserve"> {{ </w:t>
-            </w:r>
-            <w:r>
-              <w:t>project_metadata.</w:t>
-            </w:r>
+              <w:t xml:space="preserve"> </w:t>
+            </w:r>
+            <w:proofErr w:type="gramStart"/>
+            <w:r>
+              <w:t xml:space="preserve">{{ </w:t>
+            </w:r>
+            <w:proofErr w:type="spellStart"/>
+            <w:r>
+              <w:t>project_metadata</w:t>
+            </w:r>
+            <w:proofErr w:type="spellEnd"/>
+            <w:r>
+              <w:t>.</w:t>
+            </w:r>
+            <w:proofErr w:type="spellStart"/>
             <w:r>
               <w:rPr>
                 <w:lang w:val="en-US"/>
               </w:rPr>
-              <w:t>log_init_date</w:t>
-            </w:r>
+              <w:t>log</w:t>
+            </w:r>
+            <w:proofErr w:type="gramEnd"/>
+            <w:r>
+              <w:rPr>
+                <w:lang w:val="en-US"/>
+              </w:rPr>
+              <w:t>_init_date</w:t>
+            </w:r>
+            <w:proofErr w:type="spellEnd"/>
             <w:r>
               <w:t xml:space="preserve"> }}</w:t>
             </w:r>
@@ -398,20 +635,43 @@
               <w:t>Log last updated date:</w:t>
             </w:r>
             <w:r>
-              <w:t xml:space="preserve"> {{ </w:t>
-            </w:r>
-            <w:r>
-              <w:t>project_metadata</w:t>
-            </w:r>
+              <w:t xml:space="preserve"> </w:t>
+            </w:r>
+            <w:proofErr w:type="gramStart"/>
+            <w:r>
+              <w:t xml:space="preserve">{{ </w:t>
+            </w:r>
+            <w:proofErr w:type="spellStart"/>
+            <w:r>
+              <w:t>project</w:t>
+            </w:r>
+            <w:proofErr w:type="gramEnd"/>
+            <w:r>
+              <w:t>_</w:t>
+            </w:r>
+            <w:proofErr w:type="gramStart"/>
+            <w:r>
+              <w:t>metadata</w:t>
+            </w:r>
+            <w:proofErr w:type="spellEnd"/>
             <w:r>
               <w:t>.</w:t>
             </w:r>
+            <w:proofErr w:type="spellStart"/>
             <w:r>
               <w:rPr>
                 <w:lang w:val="en-US"/>
               </w:rPr>
-              <w:t>last_modified_datetime</w:t>
-            </w:r>
+              <w:t>last</w:t>
+            </w:r>
+            <w:proofErr w:type="gramEnd"/>
+            <w:r>
+              <w:rPr>
+                <w:lang w:val="en-US"/>
+              </w:rPr>
+              <w:t>_modified_datetime</w:t>
+            </w:r>
+            <w:proofErr w:type="spellEnd"/>
             <w:r>
               <w:t xml:space="preserve"> }}</w:t>
             </w:r>
@@ -434,11 +694,11 @@
       </w:tblPr>
       <w:tblGrid>
         <w:gridCol w:w="620"/>
-        <w:gridCol w:w="5018"/>
-        <w:gridCol w:w="6232"/>
-        <w:gridCol w:w="883"/>
-        <w:gridCol w:w="7487"/>
-        <w:gridCol w:w="1170"/>
+        <w:gridCol w:w="6883"/>
+        <w:gridCol w:w="4253"/>
+        <w:gridCol w:w="2268"/>
+        <w:gridCol w:w="5528"/>
+        <w:gridCol w:w="1858"/>
         <w:gridCol w:w="997"/>
       </w:tblGrid>
       <w:tr>
@@ -482,7 +742,7 @@
         </w:tc>
         <w:tc>
           <w:tcPr>
-            <w:tcW w:w="5018" w:type="dxa"/>
+            <w:tcW w:w="6883" w:type="dxa"/>
             <w:tcBorders>
               <w:top w:val="single" w:sz="8" w:space="0" w:color="000000"/>
               <w:left w:val="single" w:sz="8" w:space="0" w:color="000000"/>
@@ -516,7 +776,7 @@
         </w:tc>
         <w:tc>
           <w:tcPr>
-            <w:tcW w:w="6232" w:type="dxa"/>
+            <w:tcW w:w="4253" w:type="dxa"/>
             <w:tcBorders>
               <w:top w:val="single" w:sz="4" w:space="0" w:color="auto"/>
               <w:bottom w:val="single" w:sz="4" w:space="0" w:color="auto"/>
@@ -535,13 +795,13 @@
                 <w:b/>
                 <w:bCs/>
               </w:rPr>
-              <w:t>Check Type, Tool Checklist and Results (if Applicable), Curator Checklist</w:t>
+              <w:t>Information Location</w:t>
             </w:r>
           </w:p>
         </w:tc>
         <w:tc>
           <w:tcPr>
-            <w:tcW w:w="883" w:type="dxa"/>
+            <w:tcW w:w="2268" w:type="dxa"/>
             <w:tcBorders>
               <w:top w:val="single" w:sz="8" w:space="0" w:color="000000"/>
               <w:left w:val="single" w:sz="4" w:space="0" w:color="auto"/>
@@ -569,13 +829,13 @@
                 <w:b/>
                 <w:bCs/>
               </w:rPr>
-              <w:t>Status</w:t>
+              <w:t>Priority</w:t>
             </w:r>
           </w:p>
         </w:tc>
         <w:tc>
           <w:tcPr>
-            <w:tcW w:w="7487" w:type="dxa"/>
+            <w:tcW w:w="5528" w:type="dxa"/>
             <w:tcBorders>
               <w:top w:val="single" w:sz="8" w:space="0" w:color="000000"/>
               <w:left w:val="single" w:sz="8" w:space="0" w:color="000000"/>
@@ -609,7 +869,7 @@
         </w:tc>
         <w:tc>
           <w:tcPr>
-            <w:tcW w:w="1170" w:type="dxa"/>
+            <w:tcW w:w="1858" w:type="dxa"/>
             <w:tcBorders>
               <w:top w:val="single" w:sz="8" w:space="0" w:color="000000"/>
               <w:left w:val="single" w:sz="8" w:space="0" w:color="000000"/>
@@ -637,7 +897,7 @@
                 <w:b/>
                 <w:bCs/>
               </w:rPr>
-              <w:t>Priority</w:t>
+              <w:t>Status</w:t>
             </w:r>
           </w:p>
         </w:tc>
@@ -766,7 +1026,7 @@
         </w:tc>
         <w:tc>
           <w:tcPr>
-            <w:tcW w:w="5018" w:type="dxa"/>
+            <w:tcW w:w="6883" w:type="dxa"/>
             <w:tcBorders>
               <w:top w:val="single" w:sz="8" w:space="0" w:color="000000"/>
               <w:left w:val="single" w:sz="8" w:space="0" w:color="000000"/>
@@ -791,7 +1051,7 @@
         </w:tc>
         <w:tc>
           <w:tcPr>
-            <w:tcW w:w="6232" w:type="dxa"/>
+            <w:tcW w:w="4253" w:type="dxa"/>
             <w:tcBorders>
               <w:top w:val="single" w:sz="4" w:space="0" w:color="auto"/>
               <w:bottom w:val="single" w:sz="4" w:space="0" w:color="auto"/>
@@ -808,7 +1068,7 @@
         </w:tc>
         <w:tc>
           <w:tcPr>
-            <w:tcW w:w="883" w:type="dxa"/>
+            <w:tcW w:w="2268" w:type="dxa"/>
             <w:tcBorders>
               <w:top w:val="single" w:sz="8" w:space="0" w:color="000000"/>
               <w:left w:val="single" w:sz="4" w:space="0" w:color="auto"/>
@@ -833,7 +1093,7 @@
         </w:tc>
         <w:tc>
           <w:tcPr>
-            <w:tcW w:w="7487" w:type="dxa"/>
+            <w:tcW w:w="5528" w:type="dxa"/>
             <w:tcBorders>
               <w:top w:val="single" w:sz="8" w:space="0" w:color="000000"/>
               <w:left w:val="single" w:sz="8" w:space="0" w:color="000000"/>
@@ -851,7 +1111,7 @@
         </w:tc>
         <w:tc>
           <w:tcPr>
-            <w:tcW w:w="1170" w:type="dxa"/>
+            <w:tcW w:w="1858" w:type="dxa"/>
             <w:tcBorders>
               <w:top w:val="single" w:sz="8" w:space="0" w:color="000000"/>
               <w:left w:val="single" w:sz="8" w:space="0" w:color="000000"/>
@@ -907,6 +1167,7 @@
             </w:tcMar>
           </w:tcPr>
           <w:p>
+            <w:proofErr w:type="gramStart"/>
             <w:r>
               <w:t xml:space="preserve">{{ </w:t>
             </w:r>
@@ -916,6 +1177,7 @@
               </w:rPr>
               <w:t>item.id</w:t>
             </w:r>
+            <w:proofErr w:type="gramEnd"/>
             <w:r>
               <w:t xml:space="preserve"> }}</w:t>
             </w:r>
@@ -923,7 +1185,7 @@
         </w:tc>
         <w:tc>
           <w:tcPr>
-            <w:tcW w:w="5018" w:type="dxa"/>
+            <w:tcW w:w="6883" w:type="dxa"/>
             <w:tcBorders>
               <w:top w:val="single" w:sz="8" w:space="0" w:color="000000"/>
               <w:left w:val="single" w:sz="8" w:space="0" w:color="000000"/>
@@ -938,8 +1200,29 @@
             </w:tcMar>
           </w:tcPr>
           <w:p>
-            <w:r>
-              <w:t>{{ item.action }}</w:t>
+            <w:proofErr w:type="gramStart"/>
+            <w:r>
+              <w:t xml:space="preserve">{{ </w:t>
+            </w:r>
+            <w:proofErr w:type="spellStart"/>
+            <w:r>
+              <w:t>item</w:t>
+            </w:r>
+            <w:proofErr w:type="gramEnd"/>
+            <w:r>
+              <w:t>.</w:t>
+            </w:r>
+            <w:proofErr w:type="gramStart"/>
+            <w:r>
+              <w:t>action</w:t>
+            </w:r>
+            <w:proofErr w:type="spellEnd"/>
+            <w:r>
+              <w:t xml:space="preserve"> }</w:t>
+            </w:r>
+            <w:proofErr w:type="gramEnd"/>
+            <w:r>
+              <w:t>}</w:t>
             </w:r>
           </w:p>
           <w:p>
@@ -952,6 +1235,7 @@
                 <w:szCs w:val="20"/>
               </w:rPr>
             </w:pPr>
+            <w:proofErr w:type="gramStart"/>
             <w:r>
               <w:rPr>
                 <w:i/>
@@ -960,13 +1244,46 @@
                 <w:sz w:val="20"/>
                 <w:szCs w:val="20"/>
               </w:rPr>
-              <w:t>{{ item.instructions }}</w:t>
+              <w:t xml:space="preserve">{{ </w:t>
+            </w:r>
+            <w:proofErr w:type="spellStart"/>
+            <w:r>
+              <w:rPr>
+                <w:i/>
+                <w:iCs/>
+                <w:color w:val="171717" w:themeColor="background2" w:themeShade="1A"/>
+                <w:sz w:val="20"/>
+                <w:szCs w:val="20"/>
+              </w:rPr>
+              <w:t>item</w:t>
+            </w:r>
+            <w:proofErr w:type="gramEnd"/>
+            <w:r>
+              <w:rPr>
+                <w:i/>
+                <w:iCs/>
+                <w:color w:val="171717" w:themeColor="background2" w:themeShade="1A"/>
+                <w:sz w:val="20"/>
+                <w:szCs w:val="20"/>
+              </w:rPr>
+              <w:t>.instructions</w:t>
+            </w:r>
+            <w:proofErr w:type="spellEnd"/>
+            <w:r>
+              <w:rPr>
+                <w:i/>
+                <w:iCs/>
+                <w:color w:val="171717" w:themeColor="background2" w:themeShade="1A"/>
+                <w:sz w:val="20"/>
+                <w:szCs w:val="20"/>
+              </w:rPr>
+              <w:t xml:space="preserve"> }}</w:t>
             </w:r>
           </w:p>
         </w:tc>
         <w:tc>
           <w:tcPr>
-            <w:tcW w:w="6232" w:type="dxa"/>
+            <w:tcW w:w="4253" w:type="dxa"/>
             <w:tcBorders>
               <w:top w:val="single" w:sz="4" w:space="0" w:color="auto"/>
               <w:bottom w:val="single" w:sz="4" w:space="0" w:color="auto"/>
@@ -978,6 +1295,7 @@
                 <w:lang w:val="en-US"/>
               </w:rPr>
             </w:pPr>
+            <w:proofErr w:type="gramStart"/>
             <w:r>
               <w:rPr>
                 <w:rFonts w:hint="eastAsia"/>
@@ -997,37 +1315,71 @@
                 <w:rFonts w:hint="eastAsia"/>
                 <w:highlight w:val="yellow"/>
               </w:rPr>
-              <w:t>item.</w:t>
-            </w:r>
+              <w:t>item</w:t>
+            </w:r>
+            <w:proofErr w:type="gramEnd"/>
+            <w:r>
+              <w:rPr>
+                <w:rFonts w:hint="eastAsia"/>
+                <w:highlight w:val="yellow"/>
+              </w:rPr>
+              <w:t>.</w:t>
+            </w:r>
+            <w:proofErr w:type="spellStart"/>
             <w:r>
               <w:rPr>
                 <w:highlight w:val="yellow"/>
                 <w:lang w:val="en-US"/>
               </w:rPr>
-              <w:t>check_type</w:t>
-            </w:r>
+              <w:t>check_</w:t>
+            </w:r>
+            <w:proofErr w:type="gramStart"/>
+            <w:r>
+              <w:rPr>
+                <w:highlight w:val="yellow"/>
+                <w:lang w:val="en-US"/>
+              </w:rPr>
+              <w:t>type</w:t>
+            </w:r>
+            <w:proofErr w:type="spellEnd"/>
             <w:r>
               <w:rPr>
                 <w:rFonts w:hint="eastAsia"/>
                 <w:highlight w:val="yellow"/>
                 <w:lang w:val="en-US"/>
               </w:rPr>
-              <w:t xml:space="preserve"> }}</w:t>
+              <w:t xml:space="preserve"> }</w:t>
+            </w:r>
+            <w:proofErr w:type="gramEnd"/>
+            <w:r>
+              <w:rPr>
+                <w:rFonts w:hint="eastAsia"/>
+                <w:highlight w:val="yellow"/>
+                <w:lang w:val="en-US"/>
+              </w:rPr>
+              <w:t>}</w:t>
             </w:r>
           </w:p>
           <w:p>
             <w:pPr>
               <w:rPr>
+                <w:lang w:val="en-US"/>
+              </w:rPr>
+            </w:pPr>
+            <w:r>
+              <w:rPr>
                 <w:rFonts w:hint="eastAsia"/>
                 <w:lang w:val="en-US"/>
               </w:rPr>
-            </w:pPr>
+              <w:t xml:space="preserve">{{ </w:t>
+            </w:r>
+            <w:proofErr w:type="spellStart"/>
             <w:r>
               <w:rPr>
                 <w:rFonts w:hint="eastAsia"/>
                 <w:lang w:val="en-US"/>
               </w:rPr>
-              <w:t>{{ item.</w:t>
+              <w:t>item.</w:t>
             </w:r>
             <w:r>
               <w:rPr>
@@ -1035,6 +1387,7 @@
               </w:rPr>
               <w:t>information_location</w:t>
             </w:r>
+            <w:proofErr w:type="spellEnd"/>
             <w:r>
               <w:rPr>
                 <w:rFonts w:hint="eastAsia"/>
@@ -1046,49 +1399,204 @@
           <w:p>
             <w:pPr>
               <w:rPr>
-                <w:rFonts w:hint="eastAsia"/>
                 <w:highlight w:val="yellow"/>
               </w:rPr>
             </w:pPr>
             <w:r>
-              <w:t>{% if item.automated_check_results %}{% for key, values in item.automated_check_results.items() %}</w:t>
+              <w:t xml:space="preserve">{% if </w:t>
+            </w:r>
+            <w:proofErr w:type="spellStart"/>
+            <w:proofErr w:type="gramStart"/>
+            <w:r>
+              <w:t>item.automated</w:t>
+            </w:r>
+            <w:proofErr w:type="gramEnd"/>
+            <w:r>
+              <w:t>_check_results</w:t>
+            </w:r>
+            <w:proofErr w:type="spellEnd"/>
+            <w:r>
+              <w:t xml:space="preserve"> </w:t>
+            </w:r>
+            <w:proofErr w:type="gramStart"/>
+            <w:r>
+              <w:t>%}{</w:t>
+            </w:r>
+            <w:proofErr w:type="gramEnd"/>
+            <w:r>
+              <w:t xml:space="preserve">% for key, values in </w:t>
+            </w:r>
+            <w:proofErr w:type="spellStart"/>
+            <w:proofErr w:type="gramStart"/>
+            <w:r>
+              <w:t>item.automated</w:t>
+            </w:r>
+            <w:proofErr w:type="gramEnd"/>
+            <w:r>
+              <w:t>_check_</w:t>
+            </w:r>
+            <w:proofErr w:type="gramStart"/>
+            <w:r>
+              <w:t>results.items</w:t>
+            </w:r>
+            <w:proofErr w:type="spellEnd"/>
+            <w:proofErr w:type="gramEnd"/>
+            <w:r>
+              <w:t>() %}</w:t>
             </w:r>
             <w:r>
               <w:br/>
             </w:r>
+            <w:proofErr w:type="gramStart"/>
             <w:r>
               <w:rPr>
                 <w:b/>
                 <w:bCs/>
               </w:rPr>
-              <w:t>{{ key }}</w:t>
-            </w:r>
-            <w:r>
-              <w:t>:{% if values %}{% for v in values %}</w:t>
+              <w:t>{{ key</w:t>
+            </w:r>
+            <w:proofErr w:type="gramEnd"/>
+            <w:r>
+              <w:rPr>
+                <w:b/>
+                <w:bCs/>
+              </w:rPr>
+              <w:t xml:space="preserve"> }</w:t>
+            </w:r>
+            <w:proofErr w:type="gramStart"/>
+            <w:r>
+              <w:rPr>
+                <w:b/>
+                <w:bCs/>
+              </w:rPr>
+              <w:t>}</w:t>
+            </w:r>
+            <w:r>
+              <w:t>:{</w:t>
+            </w:r>
+            <w:proofErr w:type="gramEnd"/>
+            <w:r>
+              <w:t xml:space="preserve">% if values </w:t>
+            </w:r>
+            <w:proofErr w:type="gramStart"/>
+            <w:r>
+              <w:t>%}{</w:t>
+            </w:r>
+            <w:proofErr w:type="gramEnd"/>
+            <w:r>
+              <w:t>% for v in values %}</w:t>
             </w:r>
             <w:r>
               <w:br/>
             </w:r>
-            <w:r>
-              <w:t>{{ loop.index }}. {{ v }}</w:t>
-            </w:r>
-            <w:r>
-              <w:t>{% endfor %}{% else %}</w:t>
+            <w:proofErr w:type="gramStart"/>
+            <w:r>
+              <w:t xml:space="preserve">{{ </w:t>
+            </w:r>
+            <w:proofErr w:type="spellStart"/>
+            <w:r>
+              <w:t>loop</w:t>
+            </w:r>
+            <w:proofErr w:type="gramEnd"/>
+            <w:r>
+              <w:t>.</w:t>
+            </w:r>
+            <w:proofErr w:type="gramStart"/>
+            <w:r>
+              <w:t>index</w:t>
+            </w:r>
+            <w:proofErr w:type="spellEnd"/>
+            <w:r>
+              <w:t xml:space="preserve"> }</w:t>
+            </w:r>
+            <w:proofErr w:type="gramEnd"/>
+            <w:r>
+              <w:t xml:space="preserve">}. </w:t>
+            </w:r>
+            <w:proofErr w:type="gramStart"/>
+            <w:r>
+              <w:t>{{ v</w:t>
+            </w:r>
+            <w:proofErr w:type="gramEnd"/>
+            <w:r>
+              <w:t xml:space="preserve"> </w:t>
+            </w:r>
+            <w:proofErr w:type="gramStart"/>
+            <w:r>
+              <w:t>}}</w:t>
+            </w:r>
+            <w:r>
+              <w:t>{</w:t>
+            </w:r>
+            <w:proofErr w:type="gramEnd"/>
+            <w:r>
+              <w:t xml:space="preserve">% </w:t>
+            </w:r>
+            <w:proofErr w:type="spellStart"/>
+            <w:r>
+              <w:t>endfor</w:t>
+            </w:r>
+            <w:proofErr w:type="spellEnd"/>
+            <w:r>
+              <w:t xml:space="preserve"> </w:t>
+            </w:r>
+            <w:proofErr w:type="gramStart"/>
+            <w:r>
+              <w:t>%}{</w:t>
+            </w:r>
+            <w:proofErr w:type="gramEnd"/>
+            <w:r>
+              <w:t>% else %}</w:t>
             </w:r>
             <w:r>
               <w:rPr>
                 <w:rFonts w:hint="eastAsia"/>
               </w:rPr>
-              <w:t xml:space="preserve"> None</w:t>
-            </w:r>
-            <w:r>
-              <w:t>{% endif %}{% endfor %}{% endif %}</w:t>
+              <w:t xml:space="preserve"> </w:t>
+            </w:r>
+            <w:proofErr w:type="gramStart"/>
+            <w:r>
+              <w:rPr>
+                <w:rFonts w:hint="eastAsia"/>
+              </w:rPr>
+              <w:t>None</w:t>
+            </w:r>
+            <w:r>
+              <w:t>{</w:t>
+            </w:r>
+            <w:proofErr w:type="gramEnd"/>
+            <w:r>
+              <w:t xml:space="preserve">% endif </w:t>
+            </w:r>
+            <w:proofErr w:type="gramStart"/>
+            <w:r>
+              <w:t>%}{</w:t>
+            </w:r>
+            <w:proofErr w:type="gramEnd"/>
+            <w:r>
+              <w:t xml:space="preserve">% </w:t>
+            </w:r>
+            <w:proofErr w:type="spellStart"/>
+            <w:r>
+              <w:t>endfor</w:t>
+            </w:r>
+            <w:proofErr w:type="spellEnd"/>
+            <w:r>
+              <w:t xml:space="preserve"> </w:t>
+            </w:r>
+            <w:proofErr w:type="gramStart"/>
+            <w:r>
+              <w:t>%}{</w:t>
+            </w:r>
+            <w:proofErr w:type="gramEnd"/>
+            <w:r>
+              <w:t>% endif %}</w:t>
             </w:r>
           </w:p>
         </w:tc>
         <w:tc>
           <w:tcPr>
-            <w:tcW w:w="883" w:type="dxa"/>
+            <w:tcW w:w="2268" w:type="dxa"/>
             <w:tcBorders>
               <w:top w:val="single" w:sz="8" w:space="0" w:color="000000"/>
               <w:left w:val="single" w:sz="4" w:space="0" w:color="auto"/>
@@ -1103,20 +1611,33 @@
             </w:tcMar>
           </w:tcPr>
           <w:p>
-            <w:r>
-              <w:t>{{ item.</w:t>
-            </w:r>
-            <w:r>
-              <w:t>status</w:t>
-            </w:r>
-            <w:r>
-              <w:t>}}</w:t>
+            <w:proofErr w:type="gramStart"/>
+            <w:r>
+              <w:rPr>
+                <w:rFonts w:hint="eastAsia"/>
+              </w:rPr>
+              <w:t>{</w:t>
+            </w:r>
+            <w:r>
+              <w:t xml:space="preserve">{ </w:t>
+            </w:r>
+            <w:proofErr w:type="spellStart"/>
+            <w:r>
+              <w:t>item</w:t>
+            </w:r>
+            <w:proofErr w:type="gramEnd"/>
+            <w:r>
+              <w:t>.priority</w:t>
+            </w:r>
+            <w:proofErr w:type="spellEnd"/>
+            <w:r>
+              <w:t xml:space="preserve"> }}</w:t>
             </w:r>
           </w:p>
         </w:tc>
         <w:tc>
           <w:tcPr>
-            <w:tcW w:w="7487" w:type="dxa"/>
+            <w:tcW w:w="5528" w:type="dxa"/>
             <w:tcBorders>
               <w:top w:val="single" w:sz="8" w:space="0" w:color="000000"/>
               <w:left w:val="single" w:sz="8" w:space="0" w:color="000000"/>
@@ -1131,12 +1652,22 @@
             </w:tcMar>
           </w:tcPr>
           <w:p>
-            <w:r>
-              <w:t>{{ item.</w:t>
+            <w:proofErr w:type="gramStart"/>
+            <w:r>
+              <w:t xml:space="preserve">{{ </w:t>
+            </w:r>
+            <w:proofErr w:type="spellStart"/>
+            <w:r>
+              <w:t>item</w:t>
+            </w:r>
+            <w:proofErr w:type="gramEnd"/>
+            <w:r>
+              <w:t>.</w:t>
             </w:r>
             <w:r>
               <w:t>comments</w:t>
             </w:r>
+            <w:proofErr w:type="spellEnd"/>
             <w:r>
               <w:t xml:space="preserve"> </w:t>
             </w:r>
@@ -1147,7 +1678,7 @@
         </w:tc>
         <w:tc>
           <w:tcPr>
-            <w:tcW w:w="1170" w:type="dxa"/>
+            <w:tcW w:w="1858" w:type="dxa"/>
             <w:tcBorders>
               <w:top w:val="single" w:sz="8" w:space="0" w:color="000000"/>
               <w:left w:val="single" w:sz="8" w:space="0" w:color="000000"/>
@@ -1169,12 +1700,23 @@
             </w:pPr>
             <w:r>
               <w:rPr>
-                <w:rFonts w:hint="eastAsia"/>
-              </w:rPr>
-              <w:t>{</w:t>
-            </w:r>
-            <w:r>
-              <w:t>{ item.priority }}</w:t>
+                <w:lang w:val="en-US"/>
+              </w:rPr>
+              <w:t xml:space="preserve">{{ </w:t>
+            </w:r>
+            <w:proofErr w:type="spellStart"/>
+            <w:r>
+              <w:rPr>
+                <w:lang w:val="en-US"/>
+              </w:rPr>
+              <w:t>item.status</w:t>
+            </w:r>
+            <w:proofErr w:type="spellEnd"/>
+            <w:r>
+              <w:rPr>
+                <w:lang w:val="en-US"/>
+              </w:rPr>
+              <w:t xml:space="preserve">}} </w:t>
             </w:r>
           </w:p>
         </w:tc>
@@ -1200,6 +1742,7 @@
                 <w:lang w:val="en-US"/>
               </w:rPr>
             </w:pPr>
+            <w:proofErr w:type="gramStart"/>
             <w:r>
               <w:rPr>
                 <w:rFonts w:hint="eastAsia"/>
@@ -1210,14 +1753,20 @@
               <w:t xml:space="preserve">{ </w:t>
             </w:r>
             <w:r>
-              <w:t>item.</w:t>
-            </w:r>
+              <w:t>item</w:t>
+            </w:r>
+            <w:proofErr w:type="gramEnd"/>
+            <w:r>
+              <w:t>.</w:t>
+            </w:r>
+            <w:proofErr w:type="spellStart"/>
             <w:r>
               <w:rPr>
                 <w:lang w:val="en-US"/>
               </w:rPr>
               <w:t>time_spent</w:t>
             </w:r>
+            <w:proofErr w:type="spellEnd"/>
             <w:r>
               <w:t xml:space="preserve"> }}</w:t>
             </w:r>
@@ -1271,13 +1820,29 @@
                 <w:b/>
                 <w:bCs/>
               </w:rPr>
-              <w:t xml:space="preserve"> endfor %}</w:t>
+              <w:t xml:space="preserve"> </w:t>
+            </w:r>
+            <w:proofErr w:type="spellStart"/>
+            <w:r>
+              <w:rPr>
+                <w:b/>
+                <w:bCs/>
+              </w:rPr>
+              <w:t>endfor</w:t>
+            </w:r>
+            <w:proofErr w:type="spellEnd"/>
+            <w:r>
+              <w:rPr>
+                <w:b/>
+                <w:bCs/>
+              </w:rPr>
+              <w:t xml:space="preserve"> %}</w:t>
             </w:r>
           </w:p>
         </w:tc>
         <w:tc>
           <w:tcPr>
-            <w:tcW w:w="5018" w:type="dxa"/>
+            <w:tcW w:w="6883" w:type="dxa"/>
             <w:tcBorders>
               <w:top w:val="single" w:sz="8" w:space="0" w:color="000000"/>
               <w:left w:val="single" w:sz="8" w:space="0" w:color="000000"/>
@@ -1302,7 +1867,7 @@
         </w:tc>
         <w:tc>
           <w:tcPr>
-            <w:tcW w:w="6232" w:type="dxa"/>
+            <w:tcW w:w="4253" w:type="dxa"/>
             <w:tcBorders>
               <w:top w:val="single" w:sz="4" w:space="0" w:color="auto"/>
               <w:bottom w:val="single" w:sz="4" w:space="0" w:color="auto"/>
@@ -1319,7 +1884,7 @@
         </w:tc>
         <w:tc>
           <w:tcPr>
-            <w:tcW w:w="883" w:type="dxa"/>
+            <w:tcW w:w="2268" w:type="dxa"/>
             <w:tcBorders>
               <w:top w:val="single" w:sz="8" w:space="0" w:color="000000"/>
               <w:left w:val="single" w:sz="4" w:space="0" w:color="auto"/>
@@ -1344,7 +1909,7 @@
         </w:tc>
         <w:tc>
           <w:tcPr>
-            <w:tcW w:w="7487" w:type="dxa"/>
+            <w:tcW w:w="5528" w:type="dxa"/>
             <w:tcBorders>
               <w:top w:val="single" w:sz="8" w:space="0" w:color="000000"/>
               <w:left w:val="single" w:sz="8" w:space="0" w:color="000000"/>
@@ -1362,7 +1927,7 @@
         </w:tc>
         <w:tc>
           <w:tcPr>
-            <w:tcW w:w="1170" w:type="dxa"/>
+            <w:tcW w:w="1858" w:type="dxa"/>
             <w:tcBorders>
               <w:top w:val="single" w:sz="8" w:space="0" w:color="000000"/>
               <w:left w:val="single" w:sz="8" w:space="0" w:color="000000"/>
@@ -8540,6 +9105,7 @@
   <w:style w:type="character" w:default="1" w:styleId="DefaultParagraphFont">
     <w:name w:val="Default Paragraph Font"/>
     <w:uiPriority w:val="1"/>
+    <w:semiHidden/>
     <w:unhideWhenUsed/>
   </w:style>
   <w:style w:type="table" w:default="1" w:styleId="TableNormal">

</xml_diff>